<commit_message>
Add By Style tab to the Final Research Dashboard; update methodology document
- By Style: each style equal-weighted across the five asset classes, then one EW and one Inverse Vol portfolio of the four styles (with / without NatGas)
- Methodology v4: describes the By-Style construction (Section 10)
- ENGINE_CHANGELOG.md entry

Co-Authored-By: Claude Sonnet 5.5 <noreply@anthropic.com>
</commit_message>
<xml_diff>
--- a/Analysis/Research_Methodology_v4.docx
+++ b/Analysis/Research_Methodology_v4.docx
@@ -2452,6 +2452,14 @@
       </w:r>
     </w:p>
     <w:p>
+      <w:r>
+        <w:rPr>
+          <w:i w:val="0"/>
+        </w:rPr>
+        <w:t>By-Style tab. The same ingredients are also combined in the opposite order. Each style (Momentum, Carry, Carry-Momentum, Value) is first equal-weighted across the five asset classes' own sleeves on their common dates (the Section 9.1 procedure), giving one cross-asset-class series per style. The four style series are then combined into one Equal Weight portfolio and one Inverse Vol portfolio (trailing 63 observations, lagged one day), with Energy shown including or excluding Natural Gas. The Equal Weight result is identical to the "EW sleeves, EW across" book above, because both are an equal average of the same twenty series.</w:t>
+      </w:r>
+    </w:p>
+    <w:p>
       <w:pPr>
         <w:pStyle w:val="Heading2"/>
       </w:pPr>

</xml_diff>

<commit_message>
Add updated analysis document (v2) and update methodology for three regimes
- Analysis/Risk Premia Analysis v2.docx: rebuilt on the Final Research Dashboard (five asset classes, Equal Weight and Inverse Vol, R1 2011-2016, R2 2017-2021, R3 2022-2026, ten Cross-Pair portfolios, By Style cross-commodity book); inherited explanations re-tested against curve data and outside sources
- Analysis/Research_Methodology_v4.docx: Section 3.4 horizon table and text, parameter summary, reproducibility note and as-of date updated for the three regimes

Claude-Session: https://claude.ai/code/session_018H8S3ywtnxKWQmXdqPkf3Q
</commit_message>
<xml_diff>
--- a/Analysis/Research_Methodology_v4.docx
+++ b/Analysis/Research_Methodology_v4.docx
@@ -25,7 +25,7 @@
           <w:i/>
           <w:sz w:val="22"/>
         </w:rPr>
-        <w:t>As of 11 October 2026</w:t>
+        <w:t>As of 12 October 2026</w:t>
       </w:r>
     </w:p>
     <w:p>
@@ -655,12 +655,13 @@
             <w:pPr>
               <w:spacing w:after="40" w:before="40"/>
             </w:pPr>
-            <w:r/>
+            <w:r>
+              <w:t>R1</w:t>
+            </w:r>
             <w:r>
               <w:rPr>
                 <w:sz w:val="18"/>
               </w:rPr>
-              <w:t>R1 Supercycle Unwind</w:t>
             </w:r>
           </w:p>
         </w:tc>
@@ -672,12 +673,13 @@
             <w:pPr>
               <w:spacing w:after="40" w:before="40"/>
             </w:pPr>
-            <w:r/>
+            <w:r>
+              <w:t>1 Jan 2011 to 31 Dec 2016</w:t>
+            </w:r>
             <w:r>
               <w:rPr>
                 <w:sz w:val="18"/>
               </w:rPr>
-              <w:t>1 Jan 2011 to 31 Dec 2015</w:t>
             </w:r>
           </w:p>
         </w:tc>
@@ -689,12 +691,13 @@
             <w:pPr>
               <w:spacing w:after="40" w:before="40"/>
             </w:pPr>
-            <w:r/>
+            <w:r>
+              <w:t>R1 (2011-2016)</w:t>
+            </w:r>
             <w:r>
               <w:rPr>
                 <w:sz w:val="18"/>
               </w:rPr>
-              <w:t>R1 (2011-2015)</w:t>
             </w:r>
           </w:p>
         </w:tc>
@@ -708,12 +711,13 @@
             <w:pPr>
               <w:spacing w:after="40" w:before="40"/>
             </w:pPr>
-            <w:r/>
+            <w:r>
+              <w:t>R2</w:t>
+            </w:r>
             <w:r>
               <w:rPr>
                 <w:sz w:val="18"/>
               </w:rPr>
-              <w:t>R2 Recovery / Stabilisation</w:t>
             </w:r>
           </w:p>
         </w:tc>
@@ -725,12 +729,13 @@
             <w:pPr>
               <w:spacing w:after="40" w:before="40"/>
             </w:pPr>
-            <w:r/>
+            <w:r>
+              <w:t>1 Jan 2017 to 31 Dec 2021</w:t>
+            </w:r>
             <w:r>
               <w:rPr>
                 <w:sz w:val="18"/>
               </w:rPr>
-              <w:t>1 Jan 2016 to 31 Dec 2019</w:t>
             </w:r>
           </w:p>
         </w:tc>
@@ -742,12 +747,13 @@
             <w:pPr>
               <w:spacing w:after="40" w:before="40"/>
             </w:pPr>
-            <w:r/>
+            <w:r>
+              <w:t>R2 (2017-2021)</w:t>
+            </w:r>
             <w:r>
               <w:rPr>
                 <w:sz w:val="18"/>
               </w:rPr>
-              <w:t>R2 (2016-2019)</w:t>
             </w:r>
           </w:p>
         </w:tc>
@@ -761,12 +767,13 @@
             <w:pPr>
               <w:spacing w:after="40" w:before="40"/>
             </w:pPr>
-            <w:r/>
+            <w:r>
+              <w:t>R3</w:t>
+            </w:r>
             <w:r>
               <w:rPr>
                 <w:sz w:val="18"/>
               </w:rPr>
-              <w:t>R3 COVID Shock</w:t>
             </w:r>
           </w:p>
         </w:tc>
@@ -778,12 +785,13 @@
             <w:pPr>
               <w:spacing w:after="40" w:before="40"/>
             </w:pPr>
-            <w:r/>
+            <w:r>
+              <w:t>1 Jan 2022 to 23 Sep 2026 (end of data)</w:t>
+            </w:r>
             <w:r>
               <w:rPr>
                 <w:sz w:val="18"/>
               </w:rPr>
-              <w:t>1 Jan 2020 to 31 Dec 2021</w:t>
             </w:r>
           </w:p>
         </w:tc>
@@ -795,65 +803,13 @@
             <w:pPr>
               <w:spacing w:after="40" w:before="40"/>
             </w:pPr>
-            <w:r/>
+            <w:r>
+              <w:t>R3 (2022-2026)</w:t>
+            </w:r>
             <w:r>
               <w:rPr>
                 <w:sz w:val="18"/>
               </w:rPr>
-              <w:t>R3 (2020-2021)</w:t>
-            </w:r>
-          </w:p>
-        </w:tc>
-      </w:tr>
-      <w:tr>
-        <w:tc>
-          <w:tcPr>
-            <w:tcW w:type="dxa" w:w="3456"/>
-          </w:tcPr>
-          <w:p>
-            <w:pPr>
-              <w:spacing w:after="40" w:before="40"/>
-            </w:pPr>
-            <w:r/>
-            <w:r>
-              <w:rPr>
-                <w:sz w:val="18"/>
-              </w:rPr>
-              <w:t>R4 Post-COVID / Russia-Ukraine</w:t>
-            </w:r>
-          </w:p>
-        </w:tc>
-        <w:tc>
-          <w:tcPr>
-            <w:tcW w:type="dxa" w:w="3744"/>
-          </w:tcPr>
-          <w:p>
-            <w:pPr>
-              <w:spacing w:after="40" w:before="40"/>
-            </w:pPr>
-            <w:r/>
-            <w:r>
-              <w:rPr>
-                <w:sz w:val="18"/>
-              </w:rPr>
-              <w:t>1 Jan 2022 to 23 Sep 2026 (end of data)</w:t>
-            </w:r>
-          </w:p>
-        </w:tc>
-        <w:tc>
-          <w:tcPr>
-            <w:tcW w:type="dxa" w:w="2448"/>
-          </w:tcPr>
-          <w:p>
-            <w:pPr>
-              <w:spacing w:after="40" w:before="40"/>
-            </w:pPr>
-            <w:r/>
-            <w:r>
-              <w:rPr>
-                <w:sz w:val="18"/>
-              </w:rPr>
-              <w:t>R4 (2022-2026)</w:t>
             </w:r>
           </w:p>
         </w:tc>
@@ -922,7 +878,7 @@
         <w:rPr>
           <w:i w:val="0"/>
         </w:rPr>
-        <w:t>The four regimes are fixed in research/regimes.py. The 2026 year-to-date column is a subset of R4 shown for reference, not a fifth regime.</w:t>
+        <w:t>The three regimes are fixed in scripts/final_dashboard/final_regimes.py, which the Final Research Dashboard pipeline reads. They do not overlap. The earlier four-regime scheme in research/regimes.py is unchanged and is still used by run_regime_table.py and the Streamlit apps. The 2026 year-to-date column is a subset of R3 shown for reference, not a fourth regime.</w:t>
       </w:r>
     </w:p>
     <w:p>
@@ -2141,12 +2097,13 @@
             <w:pPr>
               <w:spacing w:after="40" w:before="40"/>
             </w:pPr>
-            <w:r/>
+            <w:r>
+              <w:t>Regimes R1 to R3 plus 2026 YTD</w:t>
+            </w:r>
             <w:r>
               <w:rPr>
                 <w:sz w:val="18"/>
               </w:rPr>
-              <w:t>Regimes R1 to R4 plus 2026 YTD</w:t>
             </w:r>
           </w:p>
         </w:tc>
@@ -2756,7 +2713,7 @@
         <w:rPr>
           <w:i w:val="0"/>
         </w:rPr>
-        <w:t>The dashboard is produced by the scripts in scripts/final_dashboard, run in this order from the repository root: compute_products.py (net returns of every product and sleeve), analyze_v2.py (asset-class tabs, combined books, Cross-Pair, correlations, curves), analyze_twopair.py (single-pair comparison) and build_final_dashboard_v2.py (the HTML page). The configuration (data files, roll rule, tenor pairs, lookbacks, lags) is in research/configs; the signal and return functions are in research/engine.py; the continuous series in scripts/rolling_continuous.py and research/ratio_continuous.py; the aggregation in research/cross_asset_engine.py. validate_engine.py rebuilds all 23 products x 4 sleeves from the repository defaults and compares them with the dashboard series (maximum difference 0). Dated changes are recorded in ENGINE_CHANGELOG.md.</w:t>
+        <w:t>The dashboard is produced by the scripts in scripts/final_dashboard, run in this order from the repository root: compute_products.py (net returns of every product and sleeve), analyze_v2.py (asset-class tabs, combined books, Cross-Pair, correlations, curves), analyze_twopair.py (single-pair comparison) and build_final_dashboard_v2.py (the HTML page). The configuration (data files, roll rule, tenor pairs, lookbacks, lags) is in research/configs; the signal and return functions are in research/engine.py; the continuous series in scripts/rolling_continuous.py and research/ratio_continuous.py; the aggregation in research/cross_asset_engine.py. validate_engine.py rebuilds all 23 products x 4 sleeves from the repository defaults and compares them with the dashboard series (maximum difference 0). The regime windows are set in scripts/final_dashboard/final_regimes.py and read by analyze_v2.py and analyze_twopair.py. Dated changes are recorded in ENGINE_CHANGELOG.md.</w:t>
       </w:r>
     </w:p>
     <w:sectPr>

</xml_diff>

<commit_message>
Methodology v4: add 2012 variant paragraph
Co-Authored-By: Claude Sonnet 5.5 <noreply@anthropic.com>
</commit_message>
<xml_diff>
--- a/Analysis/Research_Methodology_v4.docx
+++ b/Analysis/Research_Methodology_v4.docx
@@ -879,6 +879,14 @@
           <w:i w:val="0"/>
         </w:rPr>
         <w:t>The three regimes are fixed in scripts/final_dashboard/final_regimes.py, which the Final Research Dashboard pipeline reads. They do not overlap. The earlier four-regime scheme in research/regimes.py is unchanged and is still used by run_regime_table.py and the Streamlit apps. The 2026 year-to-date column is a subset of R3 shown for reference, not a fourth regime.</w:t>
+      </w:r>
+    </w:p>
+    <w:p>
+      <w:r>
+        <w:rPr>
+          <w:i w:val="0"/>
+        </w:rPr>
+        <w:t>2012 variant. A separate page, Analysis/Final_Research_Dashboard_2012.html (built by scripts/final_dashboard/run_2012_variant.py), shows the same results reported from 1 January 2012 in three periods: P1 2012-2016, P2 2017-2021 and P3 2022 onwards (to 23 September 2026), with no year-to-date column. Signals, rolls, costs and aggregation are identical to the main dashboard, with one exception: Value needs 504 observations (two years) of F3 before its signal starts, instead of 630, for every product. Only the four NGL products are affected (all other products are identical from 2012). With the shorter minimum, NGL Value and the NGL Inverse Vol series are defined before the window opens, so every row, including the Inverse Vol books and Cross-Pair portfolios, covers the whole of 2012 to 2026. The regime files used by the main dashboard are not used by this variant.</w:t>
       </w:r>
     </w:p>
     <w:p>

</xml_diff>

<commit_message>
Add Skewness as a fifth sleeve in the Final Research Dashboard and its 2012 variant
- compute_products: Skewness sleeve (minus 252-obs skewness of continuous-series returns, long if negative, 2-day lag)
- analyze_v2 / analyze_twopair / build: five sleeves in asset-class portfolios, combined books, By Style, Cross-Pair, correlations
- Methodology v4: Section 5.8 and five sleeves throughout; ENGINE_CHANGELOG.md entry

Co-Authored-By: Claude Sonnet 5.5 <noreply@anthropic.com>
</commit_message>
<xml_diff>
--- a/Analysis/Research_Methodology_v4.docx
+++ b/Analysis/Research_Methodology_v4.docx
@@ -41,7 +41,7 @@
         <w:rPr>
           <w:i w:val="0"/>
         </w:rPr>
-        <w:t>This document describes how every number in the Final Research Dashboard is constructed: the data, the continuous price series, the four signal sleeves, transaction costs, return and risk statistics, and the way products, sleeves and asset classes are combined. It describes methodology only and reports no performance results. Section 14 lists the known limitations and implementation details a reader needs in order to interpret the results correctly.</w:t>
+        <w:t>This document describes how every number in the Final Research Dashboard is constructed: the data, the continuous price series, the five signal sleeves, transaction costs, return and risk statistics, and the way products, sleeves and asset classes are combined. It describes methodology only and reports no performance results. Section 14 lists the known limitations and implementation details a reader needs in order to interpret the results correctly.</w:t>
       </w:r>
     </w:p>
     <w:p>
@@ -1859,6 +1859,47 @@
             <w:pPr>
               <w:spacing w:after="40" w:before="40"/>
             </w:pPr>
+            <w:r>
+              <w:t>Skewness</w:t>
+            </w:r>
+          </w:p>
+        </w:tc>
+        <w:tc>
+          <w:tcPr>
+            <w:tcW w:type="dxa" w:w="4752"/>
+          </w:tcPr>
+          <w:p>
+            <w:pPr>
+              <w:spacing w:after="40" w:before="40"/>
+            </w:pPr>
+            <w:r>
+              <w:t>Minus the skewness of daily log returns over 252 observations; +1 if negative, -1 if positive</w:t>
+            </w:r>
+          </w:p>
+        </w:tc>
+        <w:tc>
+          <w:tcPr>
+            <w:tcW w:type="dxa" w:w="2880"/>
+          </w:tcPr>
+          <w:p>
+            <w:pPr>
+              <w:spacing w:after="40" w:before="40"/>
+            </w:pPr>
+            <w:r>
+              <w:t>On the continuous series returns; lag 2 days</w:t>
+            </w:r>
+          </w:p>
+        </w:tc>
+      </w:tr>
+      <w:tr>
+        <w:tc>
+          <w:tcPr>
+            <w:tcW w:type="dxa" w:w="2016"/>
+          </w:tcPr>
+          <w:p>
+            <w:pPr>
+              <w:spacing w:after="40" w:before="40"/>
+            </w:pPr>
             <w:r/>
             <w:r>
               <w:rPr>
@@ -2124,6 +2165,22 @@
     </w:p>
     <w:p>
       <w:pPr>
+        <w:pStyle w:val="Heading3"/>
+      </w:pPr>
+      <w:r>
+        <w:t>5.8 Skewness</w:t>
+      </w:r>
+    </w:p>
+    <w:p>
+      <w:r>
+        <w:rPr>
+          <w:i w:val="0"/>
+        </w:rPr>
+        <w:t>For each product, the signal is minus the skewness of the daily log returns of its continuous (roll-adjusted) series over the past 252 observations, with a full window required. The position is +1 when the skewness is negative and -1 when it is positive, so the sleeve is long negatively skewed products, the direction reported in Table 1 of Fernandez-Perez, Fuertes and Miffre (2021). Only the sign is used, so the bias-adjusted sample skewness computed by the code and the third-moment form of the paper give the same signal. The execution shift (2 days), costs, return calculation and aggregation are the same as for the other sleeves. The paper's own construction is cross-sectional (a monthly long-short sort across energy contracts); this is the time-series version used by all sleeves in the dashboard, so its results are not comparable with the paper's. Skewness was added to the dashboard as a fifth sleeve on 12 October 2026 and is included in the EW PORT and Inverse Vol portfolios, the combined books, the By-Style tab, the Cross-Pair portfolios and the correlations.</w:t>
+      </w:r>
+    </w:p>
+    <w:p>
+      <w:pPr>
         <w:pStyle w:val="Heading2"/>
       </w:pPr>
       <w:r>
@@ -2313,7 +2370,7 @@
         <w:rPr>
           <w:i w:val="0"/>
         </w:rPr>
-        <w:t>The four sleeves (Momentum, Carry, Carry-Momentum, Value) of an asset class are combined in two ways:</w:t>
+        <w:t>The five sleeves (Momentum, Carry, Carry-Momentum, Value, Skewness) of an asset class are combined in two ways:</w:t>
       </w:r>
     </w:p>
     <w:p>
@@ -2330,7 +2387,7 @@
         <w:rPr>
           <w:i w:val="0"/>
         </w:rPr>
-        <w:t xml:space="preserve"> The simple average of the four sleeves' daily net log returns.</w:t>
+        <w:t xml:space="preserve"> The simple average of the five sleeves' daily net log returns.</w:t>
       </w:r>
     </w:p>
     <w:p>
@@ -2388,7 +2445,7 @@
         <w:rPr>
           <w:i w:val="0"/>
         </w:rPr>
-        <w:t xml:space="preserve"> Each asset class's four sleeves are combined into an asset-class portfolio by Equal Weight or by Inverse Vol (Section 9.2) - the first word of the row name ("sleeves").</w:t>
+        <w:t xml:space="preserve"> Each asset class's five sleeves are combined into an asset-class portfolio by Equal Weight or by Inverse Vol (Section 9.2) - the first word of the row name ("sleeves").</w:t>
       </w:r>
     </w:p>
     <w:p>
@@ -2421,7 +2478,7 @@
         <w:rPr>
           <w:i w:val="0"/>
         </w:rPr>
-        <w:t>By-Style tab. The same ingredients are also combined in the opposite order. Each style (Momentum, Carry, Carry-Momentum, Value) is first equal-weighted across the five asset classes' own sleeves on their common dates (the Section 9.1 procedure), giving one cross-asset-class series per style. The four style series are then combined into one Equal Weight portfolio and one Inverse Vol portfolio (trailing 63 observations, lagged one day), with Energy shown including or excluding Natural Gas. The Equal Weight result is identical to the "EW sleeves, EW across" book above, because both are an equal average of the same twenty series.</w:t>
+        <w:t>By-Style tab. The same ingredients are also combined in the opposite order. Each style (Momentum, Carry, Carry-Momentum, Value, Skewness) is first equal-weighted across the five asset classes' own sleeves on their common dates (the Section 9.1 procedure), giving one cross-asset-class series per style. The five style series are then combined into one Equal Weight portfolio and one Inverse Vol portfolio (trailing 63 observations, lagged one day), with Energy shown including or excluding Natural Gas. The Equal Weight result is identical to the "EW sleeves, EW across" book above, because both are an equal average of the same twenty-five series.</w:t>
       </w:r>
     </w:p>
     <w:p>
@@ -2512,7 +2569,7 @@
         <w:rPr>
           <w:i w:val="0"/>
         </w:rPr>
-        <w:t xml:space="preserve"> For each asset class (and Energy ex-NatGas), the correlation matrix of its four sleeves, EW PORT and Inverse Vol, using the days on which all six series are defined (for NGL this means from 23 February 2012, because its Inverse Vol series is undefined earlier; Section 14).</w:t>
+        <w:t xml:space="preserve"> For each asset class (and Energy ex-NatGas), the correlation matrix of its five sleeves, EW PORT and Inverse Vol, using the days on which all seven series are defined (for NGL this means from 23 February 2012, because its Inverse Vol series is undefined earlier; Section 14).</w:t>
       </w:r>
     </w:p>
     <w:p>
@@ -2529,7 +2586,7 @@
         <w:rPr>
           <w:i w:val="0"/>
         </w:rPr>
-        <w:t xml:space="preserve"> For each of the six series types (the four sleeves, EW PORT, Inverse Vol), the correlation matrix of the five asset classes' series (Energy including Natural Gas), aligned on common dates (Section 9.1 procedure) with only days on which all five are defined used.</w:t>
+        <w:t xml:space="preserve"> For each of the seven series types (the five sleeves, EW PORT, Inverse Vol), the correlation matrix of the five asset classes' series (Energy including Natural Gas), aligned on common dates (Section 9.1 procedure) with only days on which all five are defined used.</w:t>
       </w:r>
     </w:p>
     <w:p>
@@ -2721,7 +2778,7 @@
         <w:rPr>
           <w:i w:val="0"/>
         </w:rPr>
-        <w:t>The dashboard is produced by the scripts in scripts/final_dashboard, run in this order from the repository root: compute_products.py (net returns of every product and sleeve), analyze_v2.py (asset-class tabs, combined books, Cross-Pair, correlations, curves), analyze_twopair.py (single-pair comparison) and build_final_dashboard_v2.py (the HTML page). The configuration (data files, roll rule, tenor pairs, lookbacks, lags) is in research/configs; the signal and return functions are in research/engine.py; the continuous series in scripts/rolling_continuous.py and research/ratio_continuous.py; the aggregation in research/cross_asset_engine.py. validate_engine.py rebuilds all 23 products x 4 sleeves from the repository defaults and compares them with the dashboard series (maximum difference 0). The regime windows are set in scripts/final_dashboard/final_regimes.py and read by analyze_v2.py and analyze_twopair.py. Dated changes are recorded in ENGINE_CHANGELOG.md.</w:t>
+        <w:t>The dashboard is produced by the scripts in scripts/final_dashboard, run in this order from the repository root: compute_products.py (net returns of every product and sleeve), analyze_v2.py (asset-class tabs, combined books, Cross-Pair, correlations, curves), analyze_twopair.py (single-pair comparison) and build_final_dashboard_v2.py (the HTML page). The configuration (data files, roll rule, tenor pairs, lookbacks, lags) is in research/configs; the signal and return functions are in research/engine.py; the continuous series in scripts/rolling_continuous.py and research/ratio_continuous.py; the aggregation in research/cross_asset_engine.py. validate_engine.py rebuilds all 23 products x 5 sleeves from the repository defaults and compares them with the dashboard series (maximum difference 0). The regime windows are set in scripts/final_dashboard/final_regimes.py and read by analyze_v2.py and analyze_twopair.py. Dated changes are recorded in ENGINE_CHANGELOG.md.</w:t>
       </w:r>
     </w:p>
     <w:sectPr>

</xml_diff>

<commit_message>
Add Risk Premia Analysis v4_2012 and update Research_Methodology_v4
- Analysis/Risk Premia Analysis v4_2012.docx: v3_2012 rebuilt with Skewness as the fifth sleeve in every
  portfolio; all figures, tables and charts regenerated; every number recomputed from the per-product
  returns and audited against the 2012 dashboard dataset; external facts re-checked; v3 corrections and
  sources listed in the Verification Log appendix
- Analysis/Research_Methodology_v4.docx: new Section 5.9 (design decisions and their recorded basis),
  Skewness implementation notes (5.8), 2012-variant note (12), rewritten Statistical status bullet and
  two new limitations (14), reproducibility note (15), new Section 16 (Streamlit dashboards and hub)

Claude-Session: https://claude.ai/code/session_01EpkZtYMY22PpkHfKLDU5qK
</commit_message>
<xml_diff>
--- a/Analysis/Research_Methodology_v4.docx
+++ b/Analysis/Research_Methodology_v4.docx
@@ -29,6 +29,16 @@
       </w:r>
     </w:p>
     <w:p>
+      <w:pPr/>
+      <w:r>
+        <w:rPr>
+          <w:i/>
+          <w:sz w:val="22"/>
+        </w:rPr>
+        <w:t>Revised 12 October 2026 (second revision): Section 5.9 (design decisions and their recorded basis), the Skewness implementation notes in Sections 5.8, 12, 14 and 15, and Section 16 (Streamlit dashboards and the hub) are new. The Statistical status bullet of Section 14 is rewritten and two bullets are added to it.</w:t>
+      </w:r>
+    </w:p>
+    <w:p>
       <w:pPr>
         <w:pStyle w:val="Heading2"/>
       </w:pPr>
@@ -50,6 +60,9 @@
           <w:i w:val="0"/>
         </w:rPr>
         <w:t>The dashboard combines sleeves and asset classes by two methods only, Equal Weight and Inverse Vol, and uses only the V2 form of Carry. The code base contains other constructions (for example other Carry variants and risk-parity weighting); they are not part of the final dashboard and are not described here.</w:t>
+      </w:r>
+      <w:r>
+        <w:t xml:space="preserve"> Section 16 describes how the Streamlit dashboards and the hub implement the same sleeves.</w:t>
       </w:r>
     </w:p>
     <w:p>
@@ -2180,6 +2193,708 @@
       </w:r>
     </w:p>
     <w:p>
+      <w:pPr/>
+      <w:r>
+        <w:t>Implementation notes (added 12 October 2026). (a) The original skewness factor is cross-sectional: Fernandez-Perez, Frijns, Fuertes and Miffre (2018, Journal of Banking and Finance 86, 143-158) go long the most negatively skewed and short the most positively skewed commodities; the 2021 paper applies it to energy futures. (b) Warm-up: a full 252-observation window of continuous-series returns is required, so a product's first position starts two trading days after its first signal, between 28 December 2006 and 9 January 2007 for Metals, Energy, Precious Metals and Agriculture and between 19 August and 15 December 2010 for NGL (Isobutane is the latest). Every product is therefore live before the reporting window opens. (c) A missing return inside the window would blank the signal until the window is full again; the continuous series carries a zero return over a missing price (Section 4.2) and has no missing returns in the data, so this does not occur. (d) The sleeve is not market neutral: it uses one product's own trailing year and can keep the same sign for long periods, for example while a large collapse stays inside the window or when repeated shocks keep the skewness negative. (e) The signal is computed on the ratio-stitched continuous series of Section 4.1; the Streamlit dashboards rebuild the same returns from their additive series (Section 16).</w:t>
+      </w:r>
+    </w:p>
+    <w:p>
+      <w:pPr>
+        <w:pStyle w:val="Heading3"/>
+      </w:pPr>
+      <w:r>
+        <w:t>5.9 Design Decisions and Their Recorded Basis</w:t>
+      </w:r>
+    </w:p>
+    <w:p>
+      <w:pPr/>
+      <w:r>
+        <w:t>Every parameter above was set by a research decision recorded in ENGINE_CHANGELOG.md or in Readme Portfolio construction 10 Oct.md; none is estimated or optimized by the dashboard code. The aim of the decisions is to keep the rules close to implementable practice. Where an alternative was compared, the comparison was run on the same 2011 to 2026 sample, on full-sample IR, and was not tested for significance, so the table records what each decision rests on.</w:t>
+      </w:r>
+    </w:p>
+    <w:tbl>
+      <w:tblPr>
+        <w:tblStyle w:val="TableGrid"/>
+        <w:tblW w:type="auto" w:w="0"/>
+        <w:tblLayout w:type="fixed"/>
+        <w:tblLook w:firstColumn="1" w:firstRow="1" w:lastColumn="0" w:lastRow="0" w:noHBand="0" w:noVBand="1" w:val="04A0"/>
+      </w:tblPr>
+      <w:tblGrid>
+        <w:gridCol w:w="3216"/>
+        <w:gridCol w:w="3216"/>
+        <w:gridCol w:w="3216"/>
+      </w:tblGrid>
+      <w:tr>
+        <w:tc>
+          <w:tcPr>
+            <w:tcW w:type="dxa" w:w="2448"/>
+          </w:tcPr>
+          <w:p>
+            <w:r/>
+            <w:r>
+              <w:rPr>
+                <w:b/>
+                <w:sz w:val="18"/>
+              </w:rPr>
+              <w:t>Decision</w:t>
+            </w:r>
+          </w:p>
+        </w:tc>
+        <w:tc>
+          <w:tcPr>
+            <w:tcW w:type="dxa" w:w="5040"/>
+          </w:tcPr>
+          <w:p>
+            <w:r/>
+            <w:r>
+              <w:rPr>
+                <w:b/>
+                <w:sz w:val="18"/>
+              </w:rPr>
+              <w:t>Recorded basis</w:t>
+            </w:r>
+          </w:p>
+        </w:tc>
+        <w:tc>
+          <w:tcPr>
+            <w:tcW w:type="dxa" w:w="2160"/>
+          </w:tcPr>
+          <w:p>
+            <w:r/>
+            <w:r>
+              <w:rPr>
+                <w:b/>
+                <w:sz w:val="18"/>
+              </w:rPr>
+              <w:t>Status</w:t>
+            </w:r>
+          </w:p>
+        </w:tc>
+      </w:tr>
+      <w:tr>
+        <w:tc>
+          <w:tcPr>
+            <w:tcW w:type="dxa" w:w="2448"/>
+          </w:tcPr>
+          <w:p>
+            <w:r/>
+            <w:r>
+              <w:rPr>
+                <w:sz w:val="18"/>
+              </w:rPr>
+              <w:t>Execution lag of two trading days (5.1)</w:t>
+            </w:r>
+          </w:p>
+        </w:tc>
+        <w:tc>
+          <w:tcPr>
+            <w:tcW w:type="dxa" w:w="5040"/>
+          </w:tcPr>
+          <w:p>
+            <w:r/>
+            <w:r>
+              <w:rPr>
+                <w:sz w:val="18"/>
+              </w:rPr>
+              <w:t>A signal needs the close of day s, so it cannot earn the return of day s; the position is traded on day s+1 and earns from day s+2, which avoids a same-bar look-ahead.</w:t>
+            </w:r>
+          </w:p>
+        </w:tc>
+        <w:tc>
+          <w:tcPr>
+            <w:tcW w:type="dxa" w:w="2160"/>
+          </w:tcPr>
+          <w:p>
+            <w:r/>
+            <w:r>
+              <w:rPr>
+                <w:sz w:val="18"/>
+              </w:rPr>
+              <w:t>Fixed for every sleeve</w:t>
+            </w:r>
+          </w:p>
+        </w:tc>
+      </w:tr>
+      <w:tr>
+        <w:tc>
+          <w:tcPr>
+            <w:tcW w:type="dxa" w:w="2448"/>
+          </w:tcPr>
+          <w:p>
+            <w:r/>
+            <w:r>
+              <w:rPr>
+                <w:sz w:val="18"/>
+              </w:rPr>
+              <w:t>NGL continuous series on the sheet's second and third columns (4.3)</w:t>
+            </w:r>
+          </w:p>
+        </w:tc>
+        <w:tc>
+          <w:tcPr>
+            <w:tcW w:type="dxa" w:w="5040"/>
+          </w:tcPr>
+          <w:p>
+            <w:r/>
+            <w:r>
+              <w:rPr>
+                <w:sz w:val="18"/>
+              </w:rPr>
+              <w:t>The first column of the NGL sheets is an average-price series that does not reflect where positions would be traded (project convention).</w:t>
+            </w:r>
+          </w:p>
+        </w:tc>
+        <w:tc>
+          <w:tcPr>
+            <w:tcW w:type="dxa" w:w="2160"/>
+          </w:tcPr>
+          <w:p>
+            <w:r/>
+            <w:r>
+              <w:rPr>
+                <w:sz w:val="18"/>
+              </w:rPr>
+              <w:t>Applies to Momentum and returns; Carry and Value use the literal columns</w:t>
+            </w:r>
+          </w:p>
+        </w:tc>
+      </w:tr>
+      <w:tr>
+        <w:tc>
+          <w:tcPr>
+            <w:tcW w:type="dxa" w:w="2448"/>
+          </w:tcPr>
+          <w:p>
+            <w:r/>
+            <w:r>
+              <w:rPr>
+                <w:sz w:val="18"/>
+              </w:rPr>
+              <w:t>NGL Carry pairs F2-F4 and F2-F14 (5.6)</w:t>
+            </w:r>
+          </w:p>
+        </w:tc>
+        <w:tc>
+          <w:tcPr>
+            <w:tcW w:type="dxa" w:w="5040"/>
+          </w:tcPr>
+          <w:p>
+            <w:r/>
+            <w:r>
+              <w:rPr>
+                <w:sz w:val="18"/>
+              </w:rPr>
+              <w:t>F4 was originally chosen to avoid heating-season seasonality, which F2 brings back (10 October note).</w:t>
+            </w:r>
+          </w:p>
+        </w:tc>
+        <w:tc>
+          <w:tcPr>
+            <w:tcW w:type="dxa" w:w="2160"/>
+          </w:tcPr>
+          <w:p>
+            <w:r/>
+            <w:r>
+              <w:rPr>
+                <w:sz w:val="18"/>
+              </w:rPr>
+              <w:t>Provisional</w:t>
+            </w:r>
+          </w:p>
+        </w:tc>
+      </w:tr>
+      <w:tr>
+        <w:tc>
+          <w:tcPr>
+            <w:tcW w:type="dxa" w:w="2448"/>
+          </w:tcPr>
+          <w:p>
+            <w:r/>
+            <w:r>
+              <w:rPr>
+                <w:sz w:val="18"/>
+              </w:rPr>
+              <w:t>Carry: V2 only, sign-vote across tenor pairs (5.3)</w:t>
+            </w:r>
+          </w:p>
+        </w:tc>
+        <w:tc>
+          <w:tcPr>
+            <w:tcW w:type="dxa" w:w="5040"/>
+          </w:tcPr>
+          <w:p>
+            <w:r/>
+            <w:r>
+              <w:rPr>
+                <w:sz w:val="18"/>
+              </w:rPr>
+              <w:t>User decision of 10 October 2026 to simplify Carry. Compared with the previous V1+V2 composite on full-sample IR for 2011 to mid-2026: V2 higher in Metals and Energy, slightly lower in NGL, not supportive in Precious Metals. The note records it as a decision to simplify, not a proven improvement.</w:t>
+            </w:r>
+          </w:p>
+        </w:tc>
+        <w:tc>
+          <w:tcPr>
+            <w:tcW w:type="dxa" w:w="2160"/>
+          </w:tcPr>
+          <w:p>
+            <w:r/>
+            <w:r>
+              <w:rPr>
+                <w:sz w:val="18"/>
+              </w:rPr>
+              <w:t>Compared in-sample; not significance-tested; regime-dependent</w:t>
+            </w:r>
+          </w:p>
+        </w:tc>
+      </w:tr>
+      <w:tr>
+        <w:tc>
+          <w:tcPr>
+            <w:tcW w:type="dxa" w:w="2448"/>
+          </w:tcPr>
+          <w:p>
+            <w:r/>
+            <w:r>
+              <w:rPr>
+                <w:sz w:val="18"/>
+              </w:rPr>
+              <w:t>Momentum: three crossovers (5.2)</w:t>
+            </w:r>
+          </w:p>
+        </w:tc>
+        <w:tc>
+          <w:tcPr>
+            <w:tcW w:type="dxa" w:w="5040"/>
+          </w:tcPr>
+          <w:p>
+            <w:r/>
+            <w:r>
+              <w:rPr>
+                <w:sz w:val="18"/>
+              </w:rPr>
+              <w:t>Compared with the three pairs of two on IR (10 October note): the default has the highest IR in Energy and NGL, and Momentum is negative in every version in Metals and Precious Metals, so there is no case to change it.</w:t>
+            </w:r>
+          </w:p>
+        </w:tc>
+        <w:tc>
+          <w:tcPr>
+            <w:tcW w:type="dxa" w:w="2160"/>
+          </w:tcPr>
+          <w:p>
+            <w:r/>
+            <w:r>
+              <w:rPr>
+                <w:sz w:val="18"/>
+              </w:rPr>
+              <w:t>Default kept; not significance-tested</w:t>
+            </w:r>
+          </w:p>
+        </w:tc>
+      </w:tr>
+      <w:tr>
+        <w:tc>
+          <w:tcPr>
+            <w:tcW w:type="dxa" w:w="2448"/>
+          </w:tcPr>
+          <w:p>
+            <w:r/>
+            <w:r>
+              <w:rPr>
+                <w:sz w:val="18"/>
+              </w:rPr>
+              <w:t>Two tenor pairs for Precious Metals and Agriculture, long leg about 12 months out (5.6)</w:t>
+            </w:r>
+          </w:p>
+        </w:tc>
+        <w:tc>
+          <w:tcPr>
+            <w:tcW w:type="dxa" w:w="5040"/>
+          </w:tcPr>
+          <w:p>
+            <w:r/>
+            <w:r>
+              <w:rPr>
+                <w:sz w:val="18"/>
+              </w:rPr>
+              <w:t>User decision of 10 to 11 October 2026. Precious short pair F1-F2; Platinum and Palladium F5 used as is (data from February 2010). The single-pair comparison is reported with the results.</w:t>
+            </w:r>
+          </w:p>
+        </w:tc>
+        <w:tc>
+          <w:tcPr>
+            <w:tcW w:type="dxa" w:w="2160"/>
+          </w:tcPr>
+          <w:p>
+            <w:r/>
+            <w:r>
+              <w:rPr>
+                <w:sz w:val="18"/>
+              </w:rPr>
+              <w:t>In-sample sensitivity study (ENGINE_CHANGELOG, 2026-10-11)</w:t>
+            </w:r>
+          </w:p>
+        </w:tc>
+      </w:tr>
+      <w:tr>
+        <w:tc>
+          <w:tcPr>
+            <w:tcW w:type="dxa" w:w="2448"/>
+          </w:tcPr>
+          <w:p>
+            <w:r/>
+            <w:r>
+              <w:rPr>
+                <w:sz w:val="18"/>
+              </w:rPr>
+              <w:t>Precious Metals and Agriculture calendars aligned to Bloomberg contract months (3.3)</w:t>
+            </w:r>
+          </w:p>
+        </w:tc>
+        <w:tc>
+          <w:tcPr>
+            <w:tcW w:type="dxa" w:w="5040"/>
+          </w:tcPr>
+          <w:p>
+            <w:r/>
+            <w:r>
+              <w:rPr>
+                <w:sz w:val="18"/>
+              </w:rPr>
+              <w:t>Exact price matching showed that Bloomberg's generic series switch contract only on each product's own cycle; the unaligned calendar produced spurious roll events (phase changes per Precious Metals product fell from 987 to between 331 and 495 after alignment).</w:t>
+            </w:r>
+          </w:p>
+        </w:tc>
+        <w:tc>
+          <w:tcPr>
+            <w:tcW w:type="dxa" w:w="2160"/>
+          </w:tcPr>
+          <w:p>
+            <w:r/>
+            <w:r>
+              <w:rPr>
+                <w:sz w:val="18"/>
+              </w:rPr>
+              <w:t>Data-quality fix</w:t>
+            </w:r>
+          </w:p>
+        </w:tc>
+      </w:tr>
+      <w:tr>
+        <w:tc>
+          <w:tcPr>
+            <w:tcW w:type="dxa" w:w="2448"/>
+          </w:tcPr>
+          <w:p>
+            <w:r/>
+            <w:r>
+              <w:rPr>
+                <w:sz w:val="18"/>
+              </w:rPr>
+              <w:t>Roll on the 5th trading day of the month of the last trade date (4.2)</w:t>
+            </w:r>
+          </w:p>
+        </w:tc>
+        <w:tc>
+          <w:tcPr>
+            <w:tcW w:type="dxa" w:w="5040"/>
+          </w:tcPr>
+          <w:p>
+            <w:r/>
+            <w:r>
+              <w:rPr>
+                <w:sz w:val="18"/>
+              </w:rPr>
+              <w:t>User decision of 10 to 11 October 2026. The Streamlit option 'Nth trading day of the expiry month' implements the same rule.</w:t>
+            </w:r>
+          </w:p>
+        </w:tc>
+        <w:tc>
+          <w:tcPr>
+            <w:tcW w:type="dxa" w:w="2160"/>
+          </w:tcPr>
+          <w:p>
+            <w:r/>
+            <w:r>
+              <w:rPr>
+                <w:sz w:val="18"/>
+              </w:rPr>
+              <w:t>Same rule for every product</w:t>
+            </w:r>
+          </w:p>
+        </w:tc>
+      </w:tr>
+      <w:tr>
+        <w:tc>
+          <w:tcPr>
+            <w:tcW w:type="dxa" w:w="2448"/>
+          </w:tcPr>
+          <w:p>
+            <w:r/>
+            <w:r>
+              <w:rPr>
+                <w:sz w:val="18"/>
+              </w:rPr>
+              <w:t>Agriculture limited to six products (2)</w:t>
+            </w:r>
+          </w:p>
+        </w:tc>
+        <w:tc>
+          <w:tcPr>
+            <w:tcW w:type="dxa" w:w="5040"/>
+          </w:tcPr>
+          <w:p>
+            <w:r/>
+            <w:r>
+              <w:rPr>
+                <w:sz w:val="18"/>
+              </w:rPr>
+              <w:t>Decision of 11 October 2026 (README); the six use the Bloomberg-matched calendar. The reason for excluding the other nine is not recorded in the repository.</w:t>
+            </w:r>
+          </w:p>
+        </w:tc>
+        <w:tc>
+          <w:tcPr>
+            <w:tcW w:type="dxa" w:w="2160"/>
+          </w:tcPr>
+          <w:p>
+            <w:r/>
+            <w:r>
+              <w:rPr>
+                <w:sz w:val="18"/>
+              </w:rPr>
+              <w:t>Reason to be confirmed</w:t>
+            </w:r>
+          </w:p>
+        </w:tc>
+      </w:tr>
+      <w:tr>
+        <w:tc>
+          <w:tcPr>
+            <w:tcW w:type="dxa" w:w="2448"/>
+          </w:tcPr>
+          <w:p>
+            <w:r/>
+            <w:r>
+              <w:rPr>
+                <w:sz w:val="18"/>
+              </w:rPr>
+              <w:t>Energy and the combined books shown with and without Natural Gas (2)</w:t>
+            </w:r>
+          </w:p>
+        </w:tc>
+        <w:tc>
+          <w:tcPr>
+            <w:tcW w:type="dxa" w:w="5040"/>
+          </w:tcPr>
+          <w:p>
+            <w:r/>
+            <w:r>
+              <w:rPr>
+                <w:sz w:val="18"/>
+              </w:rPr>
+              <w:t>Reported both ways so that the effect of the product is visible; no result is dropped.</w:t>
+            </w:r>
+          </w:p>
+        </w:tc>
+        <w:tc>
+          <w:tcPr>
+            <w:tcW w:type="dxa" w:w="2160"/>
+          </w:tcPr>
+          <w:p>
+            <w:r/>
+            <w:r>
+              <w:rPr>
+                <w:sz w:val="18"/>
+              </w:rPr>
+              <w:t>Presentation</w:t>
+            </w:r>
+          </w:p>
+        </w:tc>
+      </w:tr>
+      <w:tr>
+        <w:tc>
+          <w:tcPr>
+            <w:tcW w:type="dxa" w:w="2448"/>
+          </w:tcPr>
+          <w:p>
+            <w:r/>
+            <w:r>
+              <w:rPr>
+                <w:sz w:val="18"/>
+              </w:rPr>
+              <w:t>Value needs 630 observations of F3 (5.5); 504 in the 2012 variant (3.4)</w:t>
+            </w:r>
+          </w:p>
+        </w:tc>
+        <w:tc>
+          <w:tcPr>
+            <w:tcW w:type="dxa" w:w="5040"/>
+          </w:tcPr>
+          <w:p>
+            <w:r/>
+            <w:r>
+              <w:rPr>
+                <w:sz w:val="18"/>
+              </w:rPr>
+              <w:t>504 makes NGL Value and the NGL Inverse Vol series defined from 1 January 2012.</w:t>
+            </w:r>
+          </w:p>
+        </w:tc>
+        <w:tc>
+          <w:tcPr>
+            <w:tcW w:type="dxa" w:w="2160"/>
+          </w:tcPr>
+          <w:p>
+            <w:r/>
+            <w:r>
+              <w:rPr>
+                <w:sz w:val="18"/>
+              </w:rPr>
+              <w:t>2012 variant only</w:t>
+            </w:r>
+          </w:p>
+        </w:tc>
+      </w:tr>
+      <w:tr>
+        <w:tc>
+          <w:tcPr>
+            <w:tcW w:type="dxa" w:w="2448"/>
+          </w:tcPr>
+          <w:p>
+            <w:r/>
+            <w:r>
+              <w:rPr>
+                <w:sz w:val="18"/>
+              </w:rPr>
+              <w:t>Skewness: time-series sign rule on 252 observations (5.8)</w:t>
+            </w:r>
+          </w:p>
+        </w:tc>
+        <w:tc>
+          <w:tcPr>
+            <w:tcW w:type="dxa" w:w="5040"/>
+          </w:tcPr>
+          <w:p>
+            <w:r/>
+            <w:r>
+              <w:rPr>
+                <w:sz w:val="18"/>
+              </w:rPr>
+              <w:t>Same structure as the other sleeves; one year of daily returns as in Table 1 of the 2021 paper; the paper's cross-sectional sort is not used.</w:t>
+            </w:r>
+          </w:p>
+        </w:tc>
+        <w:tc>
+          <w:tcPr>
+            <w:tcW w:type="dxa" w:w="2160"/>
+          </w:tcPr>
+          <w:p>
+            <w:r/>
+            <w:r>
+              <w:rPr>
+                <w:sz w:val="18"/>
+              </w:rPr>
+              <w:t>Window taken from the paper; the Streamlit tab shows other windows for reference only</w:t>
+            </w:r>
+          </w:p>
+        </w:tc>
+      </w:tr>
+      <w:tr>
+        <w:tc>
+          <w:tcPr>
+            <w:tcW w:type="dxa" w:w="2448"/>
+          </w:tcPr>
+          <w:p>
+            <w:r/>
+            <w:r>
+              <w:rPr>
+                <w:sz w:val="18"/>
+              </w:rPr>
+              <w:t>Inverse Vol: 63 observations, lagged one day (9.2)</w:t>
+            </w:r>
+          </w:p>
+        </w:tc>
+        <w:tc>
+          <w:tcPr>
+            <w:tcW w:type="dxa" w:w="5040"/>
+          </w:tcPr>
+          <w:p>
+            <w:r/>
+            <w:r>
+              <w:rPr>
+                <w:sz w:val="18"/>
+              </w:rPr>
+              <w:t>Day t's weights use returns up to t-1, so the weights contain no look-ahead (lag added 11 October 2026).</w:t>
+            </w:r>
+          </w:p>
+        </w:tc>
+        <w:tc>
+          <w:tcPr>
+            <w:tcW w:type="dxa" w:w="2160"/>
+          </w:tcPr>
+          <w:p>
+            <w:r/>
+            <w:r>
+              <w:rPr>
+                <w:sz w:val="18"/>
+              </w:rPr>
+              <w:t>Fixed</w:t>
+            </w:r>
+          </w:p>
+        </w:tc>
+      </w:tr>
+      <w:tr>
+        <w:tc>
+          <w:tcPr>
+            <w:tcW w:type="dxa" w:w="2448"/>
+          </w:tcPr>
+          <w:p>
+            <w:r/>
+            <w:r>
+              <w:rPr>
+                <w:sz w:val="18"/>
+              </w:rPr>
+              <w:t>Costs: 5 bp round trip plus the roll-day charge (6)</w:t>
+            </w:r>
+          </w:p>
+        </w:tc>
+        <w:tc>
+          <w:tcPr>
+            <w:tcW w:type="dxa" w:w="5040"/>
+          </w:tcPr>
+          <w:p>
+            <w:r/>
+            <w:r>
+              <w:rPr>
+                <w:sz w:val="18"/>
+              </w:rPr>
+              <w:t>Convention used in every report in this project; the roll-day charge is half a round trip.</w:t>
+            </w:r>
+          </w:p>
+        </w:tc>
+        <w:tc>
+          <w:tcPr>
+            <w:tcW w:type="dxa" w:w="2160"/>
+          </w:tcPr>
+          <w:p>
+            <w:r/>
+            <w:r>
+              <w:rPr>
+                <w:sz w:val="18"/>
+              </w:rPr>
+              <w:t>A full 5 bp roll-day sensitivity has not been run</w:t>
+            </w:r>
+          </w:p>
+        </w:tc>
+      </w:tr>
+    </w:tbl>
+    <w:p>
+      <w:pPr/>
+      <w:r>
+        <w:t>Sensitivity studies on the same sample, recorded as local in ENGINE_CHANGELOG (2026-10-11): signal inversion (Metals, Precious Metals, Agriculture), Value look-back of 1, 3 and 5 years, combined-value versus sign-vote Carry and Carry-Momentum, the second tenor pair for Precious Metals and Agriculture, and a Platinum and Palladium F5 gap check. They informed the decisions above and are not reproduced in this document.</w:t>
+      </w:r>
+    </w:p>
+    <w:p>
       <w:pPr>
         <w:pStyle w:val="Heading2"/>
       </w:pPr>
@@ -2608,6 +3323,20 @@
     </w:p>
     <w:p>
       <w:pPr>
+        <w:pStyle w:val="ListBullet"/>
+      </w:pPr>
+      <w:r>
+        <w:rPr>
+          <w:b/>
+        </w:rPr>
+        <w:t>2012 variant.</w:t>
+      </w:r>
+      <w:r>
+        <w:t xml:space="preserve"> In the 2012 variant (Analysis/Final_Research_Dashboard_2012.html) all correlations start on 1 January 2012 and the NGL Inverse Vol series is defined from the start of the window, so the NGL date note above does not apply.</w:t>
+      </w:r>
+    </w:p>
+    <w:p>
+      <w:pPr>
         <w:pStyle w:val="Heading2"/>
       </w:pPr>
       <w:r>
@@ -2759,10 +3488,35 @@
         <w:t>Statistical status.</w:t>
       </w:r>
       <w:r>
+        <w:t xml:space="preserve"> Results are a historical backtest of fixed rules over 2011 to 2026 (2012 to 2026 in the 2012 variant). No parameter is estimated or optimized by the code, and the regime and period splits are a check on stability, not an out-of-sample test. Several design decisions (Section 5.9) rest on comparisons run on the same sample, and no significance test, out-of-sample test or multiple-testing correction has been applied. Returns exclude financing, collateral income and any cost beyond the 5 bp round-trip convention.</w:t>
+      </w:r>
+    </w:p>
+    <w:p>
+      <w:pPr>
+        <w:pStyle w:val="ListBullet"/>
+      </w:pPr>
+      <w:r>
         <w:rPr>
-          <w:i w:val="0"/>
+          <w:b/>
         </w:rPr>
-        <w:t xml:space="preserve"> Results are in-sample over 2011 to 2026. Parameters were fixed by research decisions and no significance test, out-of-sample test or multiple-testing correction has been applied. Returns exclude financing, collateral income and any cost beyond the 5 bp round-trip convention.</w:t>
+        <w:t>Selection across many results.</w:t>
+      </w:r>
+      <w:r>
+        <w:t xml:space="preserve"> Each of the 23 products, five sleeves, two constructions and ten pairs is a separate result inspected on the same data. The finding that the risk premium is concentrated in NGL and Energy was identified in this sample; with no correction for the number of comparisons it is in-sample evidence.</w:t>
+      </w:r>
+    </w:p>
+    <w:p>
+      <w:pPr>
+        <w:pStyle w:val="ListBullet"/>
+      </w:pPr>
+      <w:r>
+        <w:rPr>
+          <w:b/>
+        </w:rPr>
+        <w:t>Skewness is not market neutral.</w:t>
+      </w:r>
+      <w:r>
+        <w:t xml:space="preserve"> As Section 5.8(d) explains, the sleeve can carry directional exposure for long periods, so its correlations with equities, gold or a passive commodity index depend on the sample and should not be read as a stable property.</w:t>
       </w:r>
     </w:p>
     <w:p>
@@ -2779,6 +3533,96 @@
           <w:i w:val="0"/>
         </w:rPr>
         <w:t>The dashboard is produced by the scripts in scripts/final_dashboard, run in this order from the repository root: compute_products.py (net returns of every product and sleeve), analyze_v2.py (asset-class tabs, combined books, Cross-Pair, correlations, curves), analyze_twopair.py (single-pair comparison) and build_final_dashboard_v2.py (the HTML page). The configuration (data files, roll rule, tenor pairs, lookbacks, lags) is in research/configs; the signal and return functions are in research/engine.py; the continuous series in scripts/rolling_continuous.py and research/ratio_continuous.py; the aggregation in research/cross_asset_engine.py. validate_engine.py rebuilds all 23 products x 5 sleeves from the repository defaults and compares them with the dashboard series (maximum difference 0). The regime windows are set in scripts/final_dashboard/final_regimes.py and read by analyze_v2.py and analyze_twopair.py. Dated changes are recorded in ENGINE_CHANGELOG.md.</w:t>
+      </w:r>
+    </w:p>
+    <w:p>
+      <w:pPr/>
+      <w:r>
+        <w:t>Added 12 October 2026. The Skewness sleeve is computed in compute_products.py and, separately, in scripts/final_dashboard/skewness_research.py (a research page that does not change the dashboards). The dashboard tables (asset-class tabs, all 23 products, both combined books, By Style and all Cross-Pair portfolios, 3,504 numbers) were recomputed from the per-product net returns with separate code and agree with the dashboard to within 0.0005 (Analysis/_v4_build/verify_independent.py). The Streamlit implementation is described in Section 16.</w:t>
+      </w:r>
+    </w:p>
+    <w:p>
+      <w:pPr>
+        <w:pStyle w:val="Heading2"/>
+      </w:pPr>
+      <w:r>
+        <w:t>16. Streamlit Dashboards and the Hub</w:t>
+      </w:r>
+    </w:p>
+    <w:p>
+      <w:pPr/>
+      <w:r>
+        <w:t>The five Streamlit asset-class dashboards, their Portfolio tabs and the hub's Cross-Asset tab implement the same sleeves interactively. They are not the source of the Final Research Dashboard numbers and are not reconciled sleeve by sleeve with it; Carry in particular differs, as described below.</w:t>
+      </w:r>
+    </w:p>
+    <w:p>
+      <w:pPr>
+        <w:pStyle w:val="ListBullet"/>
+      </w:pPr>
+      <w:r>
+        <w:rPr>
+          <w:b/>
+        </w:rPr>
+        <w:t>Skewness tab.</w:t>
+      </w:r>
+      <w:r>
+        <w:t xml:space="preserve"> Each dashboard has a Skewness tab built like the Momentum tab (common_engine.render_skewness_tab): look-back windows of 126, 252 and 504 observations plus a custom one, with 252 as the research window, the default execution lag of Section 5.1 and the 5 bp cost. The signal comes from one shared function, research/engine.py::raw_signal_skewness_from_returns, which the Portfolio tab and the hub also call.</w:t>
+      </w:r>
+    </w:p>
+    <w:p>
+      <w:pPr>
+        <w:pStyle w:val="ListBullet"/>
+      </w:pPr>
+      <w:r>
+        <w:rPr>
+          <w:b/>
+        </w:rPr>
+        <w:t>Return convention.</w:t>
+      </w:r>
+      <w:r>
+        <w:t xml:space="preserve"> The standalone tabs earn dollar PnL on an additively stitched F1_continuous (a running sum of dollar changes), so the logarithm of that level is not a return: it divides by the adjusted level instead of the price of the contract held and is undefined where the level is not positive. For Skewness the dashboards rebuild the exact ratio-stitched log return, log(1 + dollar change / price of the contract held at t-1), using F1_raw(t-1) on F1_Tracking days and F2_raw(t-1) on every other day (research/engine.py::ratio_log_returns). This reproduces the returns of the series in Section 4.1 to about 1e-15 for all 23 products, and the signals agree on every day.</w:t>
+      </w:r>
+    </w:p>
+    <w:p>
+      <w:pPr>
+        <w:pStyle w:val="ListBullet"/>
+      </w:pPr>
+      <w:r>
+        <w:rPr>
+          <w:b/>
+        </w:rPr>
+        <w:t>Portfolio tab.</w:t>
+      </w:r>
+      <w:r>
+        <w:t xml:space="preserve"> Skewness is a fifth strategy family (window 252, lag 2 days). The row 'Portfolio (all reference strategies)' keeps its four strategies and a new row adds Skewness. The tab uses the research log-price series, and its asset-class Skewness sleeve agrees with the Skewness sleeve of the 2012 variant dashboard for all five asset classes. Its Carry reference is the V1 plus V2 composite per tenor pair, not the sign-vote V2 of Section 5.3, so its portfolio rows are not comparable with EW PORT.</w:t>
+      </w:r>
+    </w:p>
+    <w:p>
+      <w:pPr>
+        <w:pStyle w:val="ListBullet"/>
+      </w:pPr>
+      <w:r>
+        <w:rPr>
+          <w:b/>
+        </w:rPr>
+        <w:t>Hub Cross-Asset tab.</w:t>
+      </w:r>
+      <w:r>
+        <w:t xml:space="preserve"> research/cross_asset_engine.py offers Skewness as an optional fifth style, off by default so that the four-style books are unchanged, and the hub adds an Inverse Vol combine method (1 / trailing 63-observation volatility, lagged one day) beside Equal Weight, Risk Parity and Dynamic Risk Parity. Carry follows the 10 October rule and, with default settings, each product uses its own tenor pairs as in Section 5.6. With Skewness selected, the hub's five-style Equal Weight and Inverse Vol books agree with the By Style books of the 2012 variant dashboard to two decimals in IR.</w:t>
+      </w:r>
+    </w:p>
+    <w:p>
+      <w:pPr>
+        <w:pStyle w:val="ListBullet"/>
+      </w:pPr>
+      <w:r>
+        <w:rPr>
+          <w:b/>
+        </w:rPr>
+        <w:t>Data basis.</w:t>
+      </w:r>
+      <w:r>
+        <w:t xml:space="preserve"> The hub and the dashboards read the repository configuration (Value needs 630 observations); the 2012 variant uses 504, which affects only the NGL products before 2012.</w:t>
       </w:r>
     </w:p>
     <w:sectPr>

</xml_diff>